<commit_message>
fix (PT theme - Deliverable templates): deformatting
</commit_message>
<xml_diff>
--- a/deliveries/cases/EN/5.docx
+++ b/deliveries/cases/EN/5.docx
@@ -212,7 +212,7 @@
           <w:color w:val="231f20"/>
         </w:rPr>
       </w:pPr>
-      <w:bookmarkStart w:colFirst="0" w:colLast="0" w:name="_yqxnxxy3e6cx" w:id="0"/>
+      <w:bookmarkStart w:colFirst="0" w:colLast="0" w:name="_pif6w5czx9cj" w:id="0"/>
       <w:bookmarkEnd w:id="0"/>
       <w:r>
         <w:rPr>
@@ -879,7 +879,7 @@
     </w:p>
     <w:sdt>
       <w:sdtPr>
-        <w:id w:val="874866110"/>
+        <w:id w:val="-898212085"/>
         <w:docPartObj>
           <w:docPartGallery w:val="Table of Contents"/>
           <w:docPartUnique w:val="1"/>
@@ -926,7 +926,7 @@
             <w:instrText xml:space="preserve"> TOC \h \u \z \t "Heading 1,1,Heading 2,2,Heading 3,3,"</w:instrText>
             <w:fldChar w:fldCharType="separate"/>
           </w:r>
-          <w:hyperlink w:anchor="_da9aacsepgao">
+          <w:hyperlink w:anchor="_hmud9n6ocsj6">
             <w:r>
               <w:rPr>
                 <w:rFonts w:ascii="Arial" w:cs="Arial" w:eastAsia="Arial" w:hAnsi="Arial"/>
@@ -947,7 +947,7 @@
               <w:t xml:space="preserve">1.</w:t>
             </w:r>
           </w:hyperlink>
-          <w:hyperlink w:anchor="_da9aacsepgao">
+          <w:hyperlink w:anchor="_hmud9n6ocsj6">
             <w:r>
               <w:rPr>
                 <w:rFonts w:ascii="Arial" w:cs="Arial" w:eastAsia="Arial" w:hAnsi="Arial"/>
@@ -968,7 +968,7 @@
           </w:hyperlink>
           <w:r>
             <w:fldChar w:fldCharType="begin"/>
-            <w:instrText xml:space="preserve"> PAGEREF _da9aacsepgao \h </w:instrText>
+            <w:instrText xml:space="preserve"> PAGEREF _hmud9n6ocsj6 \h </w:instrText>
             <w:fldChar w:fldCharType="separate"/>
           </w:r>
           <w:r>
@@ -1036,7 +1036,7 @@
               <w:vertAlign w:val="baseline"/>
             </w:rPr>
           </w:pPr>
-          <w:hyperlink w:anchor="_2if58vse2i4u">
+          <w:hyperlink w:anchor="_8qhsi0tvzd1a">
             <w:r>
               <w:rPr>
                 <w:rFonts w:ascii="Arial" w:cs="Arial" w:eastAsia="Arial" w:hAnsi="Arial"/>
@@ -1057,7 +1057,7 @@
               <w:t xml:space="preserve">2.</w:t>
             </w:r>
           </w:hyperlink>
-          <w:hyperlink w:anchor="_2if58vse2i4u">
+          <w:hyperlink w:anchor="_8qhsi0tvzd1a">
             <w:r>
               <w:rPr>
                 <w:rFonts w:ascii="Arial" w:cs="Arial" w:eastAsia="Arial" w:hAnsi="Arial"/>
@@ -1078,7 +1078,7 @@
           </w:hyperlink>
           <w:r>
             <w:fldChar w:fldCharType="begin"/>
-            <w:instrText xml:space="preserve"> PAGEREF _2if58vse2i4u \h </w:instrText>
+            <w:instrText xml:space="preserve"> PAGEREF _8qhsi0tvzd1a \h </w:instrText>
             <w:fldChar w:fldCharType="separate"/>
           </w:r>
           <w:r>
@@ -1146,7 +1146,7 @@
               <w:vertAlign w:val="baseline"/>
             </w:rPr>
           </w:pPr>
-          <w:hyperlink w:anchor="_12rwyl6emhoz">
+          <w:hyperlink w:anchor="_c7fci0r7ijkl">
             <w:r>
               <w:rPr>
                 <w:rFonts w:ascii="Arial" w:cs="Arial" w:eastAsia="Arial" w:hAnsi="Arial"/>
@@ -1167,7 +1167,7 @@
               <w:t xml:space="preserve">3.</w:t>
             </w:r>
           </w:hyperlink>
-          <w:hyperlink w:anchor="_12rwyl6emhoz">
+          <w:hyperlink w:anchor="_c7fci0r7ijkl">
             <w:r>
               <w:rPr>
                 <w:rFonts w:ascii="Arial" w:cs="Arial" w:eastAsia="Arial" w:hAnsi="Arial"/>
@@ -1188,7 +1188,7 @@
           </w:hyperlink>
           <w:r>
             <w:fldChar w:fldCharType="begin"/>
-            <w:instrText xml:space="preserve"> PAGEREF _12rwyl6emhoz \h </w:instrText>
+            <w:instrText xml:space="preserve"> PAGEREF _c7fci0r7ijkl \h </w:instrText>
             <w:fldChar w:fldCharType="separate"/>
           </w:r>
           <w:r>
@@ -1252,7 +1252,7 @@
           <w:color w:val="231f20"/>
         </w:rPr>
       </w:pPr>
-      <w:bookmarkStart w:colFirst="0" w:colLast="0" w:name="_3cqsdxc7x9u5" w:id="1"/>
+      <w:bookmarkStart w:colFirst="0" w:colLast="0" w:name="_ewzzbysajuq4" w:id="1"/>
       <w:bookmarkEnd w:id="1"/>
       <w:r>
         <w:br w:type="page"/>
@@ -1278,7 +1278,7 @@
           <w:color w:val="231f20"/>
         </w:rPr>
       </w:pPr>
-      <w:bookmarkStart w:colFirst="0" w:colLast="0" w:name="_da9aacsepgao" w:id="2"/>
+      <w:bookmarkStart w:colFirst="0" w:colLast="0" w:name="_hmud9n6ocsj6" w:id="2"/>
       <w:bookmarkEnd w:id="2"/>
       <w:r>
         <w:rPr>
@@ -1292,7 +1292,27 @@
     <w:p>
       <w:pPr>
         <w:ind w:left="0" w:right="0" w:firstLine="0"/>
-        <w:rPr/>
+        <w:rPr>
+          <w:rFonts w:ascii="Arial" w:cs="Arial" w:eastAsia="Arial" w:hAnsi="Arial"/>
+          <w:color w:val="231f20"/>
+        </w:rPr>
+      </w:pPr>
+      <w:r>
+        <w:rPr>
+          <w:rFonts w:ascii="Arial" w:cs="Arial" w:eastAsia="Arial" w:hAnsi="Arial"/>
+          <w:color w:val="231f20"/>
+          <w:rtl w:val="0"/>
+        </w:rPr>
+        <w:t xml:space="preserve">${TABLE_STATEMENT_OF_APPLICABILITY_SCALE}</w:t>
+      </w:r>
+    </w:p>
+    <w:p>
+      <w:pPr>
+        <w:ind w:left="0" w:right="0" w:firstLine="0"/>
+        <w:rPr>
+          <w:rFonts w:ascii="Arial" w:cs="Arial" w:eastAsia="Arial" w:hAnsi="Arial"/>
+          <w:color w:val="231f20"/>
+        </w:rPr>
         <w:sectPr>
           <w:headerReference r:id="rId7" w:type="default"/>
           <w:footerReference r:id="rId8" w:type="default"/>
@@ -1304,14 +1324,6 @@
       </w:pPr>
       <w:r>
         <w:rPr>
-          <w:rFonts w:ascii="Arial" w:cs="Arial" w:eastAsia="Arial" w:hAnsi="Arial"/>
-          <w:color w:val="231f20"/>
-          <w:rtl w:val="0"/>
-        </w:rPr>
-        <w:t xml:space="preserve">${TABLE_STATEMENT_OF_APPLICABILITY_SCALE}</w:t>
-      </w:r>
-      <w:r>
-        <w:rPr>
           <w:rtl w:val="0"/>
         </w:rPr>
       </w:r>
@@ -1331,7 +1343,7 @@
           <w:color w:val="231f20"/>
         </w:rPr>
       </w:pPr>
-      <w:bookmarkStart w:colFirst="0" w:colLast="0" w:name="_2if58vse2i4u" w:id="3"/>
+      <w:bookmarkStart w:colFirst="0" w:colLast="0" w:name="_8qhsi0tvzd1a" w:id="3"/>
       <w:bookmarkEnd w:id="3"/>
       <w:r>
         <w:rPr>
@@ -1401,7 +1413,7 @@
           <w:color w:val="231f20"/>
         </w:rPr>
       </w:pPr>
-      <w:bookmarkStart w:colFirst="0" w:colLast="0" w:name="_12rwyl6emhoz" w:id="4"/>
+      <w:bookmarkStart w:colFirst="0" w:colLast="0" w:name="_c7fci0r7ijkl" w:id="4"/>
       <w:bookmarkEnd w:id="4"/>
       <w:r>
         <w:rPr>
@@ -1824,10 +1836,10 @@
         <wp:anchor allowOverlap="1" behindDoc="0" distB="0" distT="0" distL="114300" distR="114300" hidden="0" layoutInCell="1" locked="0" relativeHeight="0" simplePos="0">
           <wp:simplePos x="0" y="0"/>
           <wp:positionH relativeFrom="column">
-            <wp:posOffset>85728</wp:posOffset>
+            <wp:posOffset>85729</wp:posOffset>
           </wp:positionH>
           <wp:positionV relativeFrom="paragraph">
-            <wp:posOffset>-73566</wp:posOffset>
+            <wp:posOffset>-73565</wp:posOffset>
           </wp:positionV>
           <wp:extent cx="1355753" cy="1011600"/>
           <wp:effectExtent b="0" l="0" r="0" t="0"/>
@@ -2438,10 +2450,10 @@
         <wp:anchor allowOverlap="1" behindDoc="0" distB="0" distT="0" distL="114300" distR="114300" hidden="0" layoutInCell="1" locked="0" relativeHeight="0" simplePos="0">
           <wp:simplePos x="0" y="0"/>
           <wp:positionH relativeFrom="column">
-            <wp:posOffset>66677</wp:posOffset>
+            <wp:posOffset>66678</wp:posOffset>
           </wp:positionH>
           <wp:positionV relativeFrom="paragraph">
-            <wp:posOffset>-47623</wp:posOffset>
+            <wp:posOffset>-47622</wp:posOffset>
           </wp:positionV>
           <wp:extent cx="1355753" cy="1011600"/>
           <wp:effectExtent b="0" l="0" r="0" t="0"/>
@@ -3019,7 +3031,7 @@
       <w:lvlText w:val="%1."/>
       <w:lvlJc w:val="left"/>
       <w:pPr>
-        <w:ind w:left="644" w:hanging="359.9999999999998"/>
+        <w:ind w:left="644" w:hanging="359.9999999999997"/>
       </w:pPr>
       <w:rPr/>
     </w:lvl>

</xml_diff>